<commit_message>
Add #67 — Inventory sync with supplier API (PHP CLI)
Implements inventory reconciliation against a simulated supplier feed:
stale-feed conflict detection, reorder-point flagging, price drift alerts,
exponential backoff retry, and a styled ANSI terminal report.
Marks item #67 complete in Automation PHP and Laravel.docx.

Co-Authored-By: Claude Sonnet 4.6 <noreply@anthropic.com>
</commit_message>
<xml_diff>
--- a/Automation for daily use/Automation/Automation PHP and Laravel.docx
+++ b/Automation for daily use/Automation/Automation PHP and Laravel.docx
@@ -2488,8 +2488,14 @@
           <w:ilvl w:val="0"/>
           <w:numId w:val="15"/>
         </w:numPr>
-      </w:pPr>
-      <w:r>
+        <w:rPr>
+          <w:color w:val="EE0000"/>
+        </w:rPr>
+      </w:pPr>
+      <w:r>
+        <w:rPr>
+          <w:color w:val="EE0000"/>
+        </w:rPr>
         <w:t>Inventory sync with supplier API</w:t>
       </w:r>
     </w:p>

</xml_diff>

<commit_message>
Add #68 — Multi-Role Approval Workflow (PHP CLI)
State-machine driven approval pipeline with self-approval conflict guard,
delegation chain injection, duplicate-decision idempotency, and closed-workflow
terminal guard. Four scenarios: happy path, delegation, rejection, and rule violations.

Co-Authored-By: Claude Sonnet 4.6 <noreply@anthropic.com>
</commit_message>
<xml_diff>
--- a/Automation for daily use/Automation/Automation PHP and Laravel.docx
+++ b/Automation for daily use/Automation/Automation PHP and Laravel.docx
@@ -2505,8 +2505,14 @@
           <w:ilvl w:val="0"/>
           <w:numId w:val="15"/>
         </w:numPr>
-      </w:pPr>
-      <w:r>
+        <w:rPr>
+          <w:color w:val="EE0000"/>
+        </w:rPr>
+      </w:pPr>
+      <w:r>
+        <w:rPr>
+          <w:color w:val="EE0000"/>
+        </w:rPr>
         <w:t>Multi-role approval workflow</w:t>
       </w:r>
     </w:p>

</xml_diff>

<commit_message>
Add #69 — Document Approval System (PHP CLI)
Multi-stage document approval pipeline with explicit state machine
(Draft → In Review → Approved / Rejected / Escalated), per-stage reviewer
quorum rules, fail-fast veto on rejection, deadline-based escalation, and
a styled terminal report. Marks item #69 red in the checklist docx.

Co-Authored-By: Claude Sonnet 4.6 <noreply@anthropic.com>
</commit_message>
<xml_diff>
--- a/Automation for daily use/Automation/Automation PHP and Laravel.docx
+++ b/Automation for daily use/Automation/Automation PHP and Laravel.docx
@@ -2522,8 +2522,14 @@
           <w:ilvl w:val="0"/>
           <w:numId w:val="15"/>
         </w:numPr>
-      </w:pPr>
-      <w:r>
+        <w:rPr>
+          <w:color w:val="EE0000"/>
+        </w:rPr>
+      </w:pPr>
+      <w:r>
+        <w:rPr>
+          <w:color w:val="EE0000"/>
+        </w:rPr>
         <w:t>Document approval system</w:t>
       </w:r>
     </w:p>

</xml_diff>

<commit_message>
Add #70 — Employee Onboarding Automation (PHP CLI)
Multi-phase onboarding pipeline with prerequisite DAG, transient/permanent
failure distinction, exponential back-off retries, idempotency guards, and
a styled terminal report. Marked complete in the docx checklist.
</commit_message>
<xml_diff>
--- a/Automation for daily use/Automation/Automation PHP and Laravel.docx
+++ b/Automation for daily use/Automation/Automation PHP and Laravel.docx
@@ -2539,8 +2539,14 @@
           <w:ilvl w:val="0"/>
           <w:numId w:val="15"/>
         </w:numPr>
-      </w:pPr>
-      <w:r>
+        <w:rPr>
+          <w:color w:val="EE0000"/>
+        </w:rPr>
+      </w:pPr>
+      <w:r>
+        <w:rPr>
+          <w:color w:val="EE0000"/>
+        </w:rPr>
         <w:t>Employee onboarding automation</w:t>
       </w:r>
     </w:p>

</xml_diff>